<commit_message>
docs/refactor: estandarizar a Version 1 y unificar referencia a dispositivos Android en documentos y sistema
</commit_message>
<xml_diff>
--- a/DOCUMENTACION_SOPORTE.docx
+++ b/DOCUMENTACION_SOPORTE.docx
@@ -103,6 +103,19 @@
                 <w:lang w:val="es-CO"/>
               </w:rPr>
               <w:t>FICHA TÉCNICA Y CONTROL DE DESARROLLO</w:t>
+              <w:br/>
+              <w:t>• Organización: Buenavista Flowers</w:t>
+              <w:br/>
+              <w:t>• Tipo de Documento: Manual Técnico de Infraestructura y Soporte de TI</w:t>
+              <w:br/>
+              <w:t>• Código Oficial: MAN-SOP-TI-2026-V1</w:t>
+              <w:br/>
+              <w:t>• Desarrollador de Software: Fernan Julián Pérez Gutiérrez (@FernanJPG1)</w:t>
+              <w:br/>
+              <w:t>• Contacto del Autor: fernansecr@gmail.com</w:t>
+              <w:br/>
+              <w:t>• Versión del Sistema: 1.0.0 (Versión 1 - Octubre 2026)</w:t>
+              <w:br/>
             </w:r>
             <w:r>
               <w:rPr>
@@ -111,7 +124,6 @@
                 <w:sz w:val="20"/>
                 <w:lang w:val="es-CO"/>
               </w:rPr>
-              <w:br/>
             </w:r>
             <w:r>
               <w:rPr>
@@ -120,7 +132,6 @@
                 <w:sz w:val="18"/>
                 <w:lang w:val="es-CO"/>
               </w:rPr>
-              <w:t xml:space="preserve">• Organización: </w:t>
             </w:r>
             <w:r>
               <w:rPr>
@@ -128,7 +139,6 @@
                 <w:sz w:val="18"/>
                 <w:lang w:val="es-CO"/>
               </w:rPr>
-              <w:t>Buenavista Flowers</w:t>
             </w:r>
             <w:r>
               <w:rPr>
@@ -136,7 +146,6 @@
                 <w:sz w:val="18"/>
                 <w:lang w:val="es-CO"/>
               </w:rPr>
-              <w:br/>
             </w:r>
             <w:r>
               <w:rPr>
@@ -145,7 +154,6 @@
                 <w:sz w:val="18"/>
                 <w:lang w:val="es-CO"/>
               </w:rPr>
-              <w:t xml:space="preserve">• Tipo de Documento: </w:t>
             </w:r>
             <w:r>
               <w:rPr>
@@ -153,7 +161,6 @@
                 <w:sz w:val="18"/>
                 <w:lang w:val="es-CO"/>
               </w:rPr>
-              <w:t>Manual Técnico de Infraestructura y Soporte de TI</w:t>
             </w:r>
             <w:r>
               <w:rPr>
@@ -161,7 +168,6 @@
                 <w:sz w:val="18"/>
                 <w:lang w:val="es-CO"/>
               </w:rPr>
-              <w:br/>
             </w:r>
             <w:r>
               <w:rPr>
@@ -170,7 +176,6 @@
                 <w:sz w:val="18"/>
                 <w:lang w:val="es-CO"/>
               </w:rPr>
-              <w:t xml:space="preserve">• Código Oficial: </w:t>
             </w:r>
             <w:r>
               <w:rPr>
@@ -178,7 +183,6 @@
                 <w:sz w:val="18"/>
                 <w:lang w:val="es-CO"/>
               </w:rPr>
-              <w:t>MAN-SOP-TI-2026-V2</w:t>
             </w:r>
             <w:r>
               <w:rPr>
@@ -186,7 +190,6 @@
                 <w:sz w:val="18"/>
                 <w:lang w:val="es-CO"/>
               </w:rPr>
-              <w:br/>
             </w:r>
             <w:r>
               <w:rPr>
@@ -195,7 +198,6 @@
                 <w:sz w:val="18"/>
                 <w:lang w:val="es-CO"/>
               </w:rPr>
-              <w:t xml:space="preserve">• Desarrollador de Software: </w:t>
             </w:r>
             <w:r>
               <w:rPr>
@@ -203,7 +205,6 @@
                 <w:sz w:val="18"/>
                 <w:lang w:val="es-CO"/>
               </w:rPr>
-              <w:t>Fernan Julián Pérez Gutiérrez (</w:t>
             </w:r>
             <w:r>
               <w:rPr>
@@ -211,7 +212,6 @@
                 <w:sz w:val="18"/>
                 <w:lang w:val="es-CO"/>
               </w:rPr>
-              <w:t>@</w:t>
             </w:r>
             <w:r>
               <w:rPr>
@@ -219,7 +219,6 @@
                 <w:sz w:val="18"/>
                 <w:lang w:val="es-CO"/>
               </w:rPr>
-              <w:t>FernanJPG1)</w:t>
             </w:r>
             <w:r>
               <w:rPr>
@@ -227,7 +226,6 @@
                 <w:sz w:val="18"/>
                 <w:lang w:val="es-CO"/>
               </w:rPr>
-              <w:br/>
             </w:r>
             <w:r>
               <w:rPr>
@@ -236,7 +234,6 @@
                 <w:sz w:val="18"/>
                 <w:lang w:val="es-CO"/>
               </w:rPr>
-              <w:t xml:space="preserve">• Contacto del Autor: </w:t>
             </w:r>
             <w:r>
               <w:rPr>
@@ -244,7 +241,6 @@
                 <w:sz w:val="18"/>
                 <w:lang w:val="es-CO"/>
               </w:rPr>
-              <w:t>fernansecr@gmail.com</w:t>
             </w:r>
             <w:r>
               <w:rPr>
@@ -252,7 +248,6 @@
                 <w:sz w:val="18"/>
                 <w:lang w:val="es-CO"/>
               </w:rPr>
-              <w:br/>
             </w:r>
             <w:r>
               <w:rPr>
@@ -261,7 +256,6 @@
                 <w:sz w:val="18"/>
                 <w:lang w:val="es-CO"/>
               </w:rPr>
-              <w:t xml:space="preserve">• Versión del Sistema: </w:t>
             </w:r>
             <w:r>
               <w:rPr>
@@ -269,7 +263,6 @@
                 <w:sz w:val="18"/>
                 <w:lang w:val="es-CO"/>
               </w:rPr>
-              <w:t>2.0.0 (Octubre 2026)</w:t>
             </w:r>
             <w:r>
               <w:rPr>
@@ -277,7 +270,6 @@
                 <w:sz w:val="18"/>
                 <w:lang w:val="es-CO"/>
               </w:rPr>
-              <w:br/>
             </w:r>
           </w:p>
         </w:tc>
@@ -441,7 +433,7 @@
           <w:sz w:val="19"/>
           <w:lang w:val="es-CO"/>
         </w:rPr>
-        <w:t>5. Base de Datos Local en Tablets (SQLite WAL y Triple Respaldo JSON)</w:t>
+        <w:t>5. Base de Datos Local en Dispositivos Android (SQLite WAL y Triple Respaldo JSON)</w:t>
       </w:r>
     </w:p>
     <w:p>
@@ -625,7 +617,7 @@
                 <w:sz w:val="17"/>
                 <w:lang w:val="es-CO"/>
               </w:rPr>
-              <w:t>|                       TABLETS DE CAMPO (ANDROID)                      |</w:t>
+              <w:t>|                       DISPOSITIVOS ANDROID DE CAMPO                      |</w:t>
             </w:r>
             <w:r>
               <w:rPr>
@@ -994,7 +986,7 @@
           <w:sz w:val="22"/>
           <w:lang w:val="es-CO"/>
         </w:rPr>
-        <w:t>2.2 Dispositivos Móviles (Tablets)</w:t>
+        <w:t>2.2 Dispositivos Móviles (Dispositivos Android)</w:t>
       </w:r>
     </w:p>
     <w:p>
@@ -1005,13 +997,7 @@
         </w:rPr>
       </w:pPr>
       <w:r>
-        <w:rPr>
-          <w:rFonts w:ascii="Calibri" w:hAnsi="Calibri"/>
-          <w:color w:val="263238"/>
-          <w:sz w:val="19"/>
-          <w:lang w:val="es-CO"/>
-        </w:rPr>
-        <w:t>Tablets Android 8.0 (API 26) o superior, 2 GB RAM mínimo (3-4 GB recomendado), pantalla 8" a 10".</w:t>
+        <w:t>Dispositivos Android 8.0 (API 26) o superior, 2 GB RAM mínimo (3-4 GB recomendado).</w:t>
       </w:r>
     </w:p>
     <w:p>
@@ -1063,7 +1049,7 @@
           <w:sz w:val="19"/>
           <w:lang w:val="es-CO"/>
         </w:rPr>
-        <w:t>Comando PowerShell obligatorio en el servidor para habilitar el tráfico de las tablets:</w:t>
+        <w:t>Comando PowerShell obligatorio en el servidor para habilitar el tráfico de los dispositivos Android:</w:t>
       </w:r>
     </w:p>
     <w:tbl>
@@ -1626,7 +1612,7 @@
           <w:sz w:val="25"/>
           <w:lang w:val="es-CO"/>
         </w:rPr>
-        <w:t>5. Base de Datos Local en Tablets (SQLite WAL y Triple Respaldo)</w:t>
+        <w:t>5. Base de Datos Local en Dispositivos Android (SQLite WAL y Triple Respaldo)</w:t>
       </w:r>
     </w:p>
     <w:p>
@@ -1643,7 +1629,7 @@
           <w:sz w:val="19"/>
           <w:lang w:val="es-CO"/>
         </w:rPr>
-        <w:t>En app_movil/lib/database/local_db.dart, SQLite se inicializa con PRAGMA journal_mode = WAL y PRAGMA synchronous = FULL. Además, PersistentBackupService monitorea el ciclo de vida de la tablet (WidgetsBindingObserver); al suspenderse o apagarse la pantalla, genera de inmediato un volcado en formato JSON independiente de la memoria volátil.</w:t>
+        <w:t>En app_movil/lib/database/local_db.dart, SQLite se inicializa con PRAGMA journal_mode = WAL y PRAGMA synchronous = FULL. Además, PersistentBackupService monitorea el ciclo de vida del dispositivo Android (WidgetsBindingObserver); al suspenderse o apagarse la pantalla, genera de inmediato un volcado en formato JSON independiente de la memoria volátil.</w:t>
       </w:r>
     </w:p>
     <w:p>
@@ -2391,7 +2377,7 @@
                 <w:sz w:val="17"/>
                 <w:lang w:val="es-CO"/>
               </w:rPr>
-              <w:t>Tablet no conecta con el servidor</w:t>
+              <w:t>Dispositivo Android no conecta con el servidor</w:t>
             </w:r>
           </w:p>
         </w:tc>
@@ -2663,7 +2649,7 @@
                 <w:sz w:val="17"/>
                 <w:lang w:val="es-CO"/>
               </w:rPr>
-              <w:t>Tablet apagada por batería baja</w:t>
+              <w:t>Dispositivo Android apagado por batería baja</w:t>
             </w:r>
           </w:p>
         </w:tc>
@@ -2721,7 +2707,7 @@
                 <w:sz w:val="17"/>
                 <w:lang w:val="es-CO"/>
               </w:rPr>
-              <w:t>Encienda la tablet y abra la app. La rutina de auto-recuperación restaurará los datos desde el archivo JSON.</w:t>
+              <w:t>Encienda el dispositivo Android y abra la app. La rutina de auto-recuperación restaurará los datos desde el archivo JSON.</w:t>
             </w:r>
           </w:p>
         </w:tc>

</xml_diff>

<commit_message>
feat: division bilateral de camas, modo mixto, exclusion de areas especiales, bloqueo temporal a 2 dias y actualizacion documental v1.1.0
</commit_message>
<xml_diff>
--- a/DOCUMENTACION_SOPORTE.docx
+++ b/DOCUMENTACION_SOPORTE.docx
@@ -89,19 +89,7 @@
             </w:tcMar>
           </w:tcPr>
           <w:p>
-            <w:pPr>
-              <w:spacing w:after="60"/>
-              <w:rPr>
-                <w:lang w:val="es-CO"/>
-              </w:rPr>
-            </w:pPr>
             <w:r>
-              <w:rPr>
-                <w:b/>
-                <w:color w:val="1B5E20"/>
-                <w:sz w:val="20"/>
-                <w:lang w:val="es-CO"/>
-              </w:rPr>
               <w:t>FICHA TÉCNICA Y CONTROL DE DESARROLLO</w:t>
               <w:br/>
               <w:t>• Organización: Buenavista Flowers</w:t>
@@ -114,162 +102,8 @@
               <w:br/>
               <w:t>• Contacto del Autor: fernansecr@gmail.com</w:t>
               <w:br/>
-              <w:t>• Versión del Sistema: 1.0.0 (Versión 1 - Octubre 2026)</w:t>
+              <w:t>• Versión del Sistema: 1.1.0 (Actualizada: Auditoría Bilateral, Desacoplamiento de Propagación y Gobernanza a 2 Días - Octubre 2026)</w:t>
               <w:br/>
-            </w:r>
-            <w:r>
-              <w:rPr>
-                <w:b/>
-                <w:color w:val="1B5E20"/>
-                <w:sz w:val="20"/>
-                <w:lang w:val="es-CO"/>
-              </w:rPr>
-            </w:r>
-            <w:r>
-              <w:rPr>
-                <w:b/>
-                <w:color w:val="2E7D32"/>
-                <w:sz w:val="18"/>
-                <w:lang w:val="es-CO"/>
-              </w:rPr>
-            </w:r>
-            <w:r>
-              <w:rPr>
-                <w:color w:val="263238"/>
-                <w:sz w:val="18"/>
-                <w:lang w:val="es-CO"/>
-              </w:rPr>
-            </w:r>
-            <w:r>
-              <w:rPr>
-                <w:color w:val="263238"/>
-                <w:sz w:val="18"/>
-                <w:lang w:val="es-CO"/>
-              </w:rPr>
-            </w:r>
-            <w:r>
-              <w:rPr>
-                <w:b/>
-                <w:color w:val="2E7D32"/>
-                <w:sz w:val="18"/>
-                <w:lang w:val="es-CO"/>
-              </w:rPr>
-            </w:r>
-            <w:r>
-              <w:rPr>
-                <w:color w:val="263238"/>
-                <w:sz w:val="18"/>
-                <w:lang w:val="es-CO"/>
-              </w:rPr>
-            </w:r>
-            <w:r>
-              <w:rPr>
-                <w:color w:val="263238"/>
-                <w:sz w:val="18"/>
-                <w:lang w:val="es-CO"/>
-              </w:rPr>
-            </w:r>
-            <w:r>
-              <w:rPr>
-                <w:b/>
-                <w:color w:val="2E7D32"/>
-                <w:sz w:val="18"/>
-                <w:lang w:val="es-CO"/>
-              </w:rPr>
-            </w:r>
-            <w:r>
-              <w:rPr>
-                <w:color w:val="263238"/>
-                <w:sz w:val="18"/>
-                <w:lang w:val="es-CO"/>
-              </w:rPr>
-            </w:r>
-            <w:r>
-              <w:rPr>
-                <w:color w:val="263238"/>
-                <w:sz w:val="18"/>
-                <w:lang w:val="es-CO"/>
-              </w:rPr>
-            </w:r>
-            <w:r>
-              <w:rPr>
-                <w:b/>
-                <w:color w:val="2E7D32"/>
-                <w:sz w:val="18"/>
-                <w:lang w:val="es-CO"/>
-              </w:rPr>
-            </w:r>
-            <w:r>
-              <w:rPr>
-                <w:color w:val="263238"/>
-                <w:sz w:val="18"/>
-                <w:lang w:val="es-CO"/>
-              </w:rPr>
-            </w:r>
-            <w:r>
-              <w:rPr>
-                <w:color w:val="263238"/>
-                <w:sz w:val="18"/>
-                <w:lang w:val="es-CO"/>
-              </w:rPr>
-            </w:r>
-            <w:r>
-              <w:rPr>
-                <w:color w:val="263238"/>
-                <w:sz w:val="18"/>
-                <w:lang w:val="es-CO"/>
-              </w:rPr>
-            </w:r>
-            <w:r>
-              <w:rPr>
-                <w:color w:val="263238"/>
-                <w:sz w:val="18"/>
-                <w:lang w:val="es-CO"/>
-              </w:rPr>
-            </w:r>
-            <w:r>
-              <w:rPr>
-                <w:b/>
-                <w:color w:val="2E7D32"/>
-                <w:sz w:val="18"/>
-                <w:lang w:val="es-CO"/>
-              </w:rPr>
-            </w:r>
-            <w:r>
-              <w:rPr>
-                <w:color w:val="263238"/>
-                <w:sz w:val="18"/>
-                <w:lang w:val="es-CO"/>
-              </w:rPr>
-            </w:r>
-            <w:r>
-              <w:rPr>
-                <w:color w:val="263238"/>
-                <w:sz w:val="18"/>
-                <w:lang w:val="es-CO"/>
-              </w:rPr>
-            </w:r>
-            <w:r>
-              <w:rPr>
-                <w:b/>
-                <w:color w:val="2E7D32"/>
-                <w:sz w:val="18"/>
-                <w:lang w:val="es-CO"/>
-              </w:rPr>
-            </w:r>
-            <w:r>
-              <w:rPr>
-                <w:color w:val="263238"/>
-                <w:sz w:val="18"/>
-                <w:lang w:val="es-CO"/>
-              </w:rPr>
-            </w:r>
-            <w:r>
-              <w:rPr>
-                <w:color w:val="263238"/>
-                <w:sz w:val="18"/>
-                <w:lang w:val="es-CO"/>
-              </w:rPr>
             </w:r>
           </w:p>
         </w:tc>
@@ -390,23 +224,7 @@
         </w:rPr>
       </w:pPr>
       <w:r>
-        <w:rPr>
-          <w:rFonts w:ascii="Calibri" w:hAnsi="Calibri"/>
-          <w:b/>
-          <w:color w:val="2E7D32"/>
-          <w:sz w:val="19"/>
-          <w:lang w:val="es-CO"/>
-        </w:rPr>
-        <w:t xml:space="preserve">• </w:t>
-      </w:r>
-      <w:r>
-        <w:rPr>
-          <w:rFonts w:ascii="Calibri" w:hAnsi="Calibri"/>
-          <w:color w:val="263238"/>
-          <w:sz w:val="19"/>
-          <w:lang w:val="es-CO"/>
-        </w:rPr>
-        <w:t>4. Base de Datos Empresarial Microsoft Access (Concurrencia, db_lock y Backups)</w:t>
+        <w:t>• 4. Base de Datos Empresarial Microsoft Access (Concurrencia, Bloqueo a 2 Días, Trazabilidad Bilateral y Backups)</w:t>
       </w:r>
     </w:p>
     <w:p>
@@ -1599,6 +1417,61 @@
     </w:p>
     <w:p>
       <w:pPr>
+        <w:pStyle w:val="Ttulo2"/>
+      </w:pPr>
+      <w:r>
+        <w:t>4.4 Política de Inmutabilidad Temporal (Bloqueo a 2 Días) y Procedimiento de Modificación en Access</w:t>
+      </w:r>
+    </w:p>
+    <w:p>
+      <w:r>
+        <w:t>El cliente móvil aplica una regla de inmutabilidad estricta (CalendarioUtil.puedeModificarSiembraPorFecha): cualquier registro con más de 48 horas (2 días calendario) desde su fecha de siembra queda bloqueado para edición o eliminación en los terminales Android de campo. Este mecanismo garantiza que los cierres agronómicos y la contabilidad de costos no sufran alteraciones inadvertidas por parte de los operarios.</w:t>
+      </w:r>
+    </w:p>
+    <w:p>
+      <w:r>
+        <w:t>Procedimiento de Soporte Técnico para Modificaciones Extemporáneas:</w:t>
+        <w:br/>
+        <w:t>1. Solicitud Formal: El supervisor de campo debe remitir el requerimiento indicando la fecha de siembra, bloque, cama y el motivo del ajuste.</w:t>
+        <w:br/>
+        <w:t>2. Acceso al Almacén Central: El personal de TI abre la base de datos empresarial bmempresarial2021.accdb en la estación servidora.</w:t>
+        <w:br/>
+        <w:t>3. Localización del Registro: En la tabla t_siembras_app (o la vista correspondiente), filtrar por cama_id y fecha_siembra.</w:t>
+        <w:br/>
+        <w:t>4. Modificación Segura: Ajustar manualmente el valor requerido (cantidad_tallos, variedad_id, operario_id, observaciones) asegurando que el campo sincronizado se mantenga coherente.</w:t>
+        <w:br/>
+        <w:t>5. Trazabilidad: El backend FastAPI reflejará de inmediato los datos consolidados en los endpoints de auditoría y catálogos.</w:t>
+      </w:r>
+    </w:p>
+    <w:p>
+      <w:pPr>
+        <w:pStyle w:val="Ttulo2"/>
+      </w:pPr>
+      <w:r>
+        <w:t>4.5 Trazabilidad de Siembras Bilaterales y Áreas Especiales en Base de Datos</w:t>
+      </w:r>
+    </w:p>
+    <w:p>
+      <w:r>
+        <w:t>Para soportar la división física de camas en Pompón y Cremón y el régimen de siembra mixta ("Pasó al otro lado"), el backend y el esquema de Access articulan la información de la siguiente manera:</w:t>
+        <w:br/>
+        <w:t>• Densidades Bilaterales Oficiales:</w:t>
+        <w:br/>
+        <w:t xml:space="preserve">    - Pompón (Total 25 esquejes por línea): Lado A = 13 esquejes por línea | Lado B = 12 esquejes por línea (Cama completa = 25 esquejes por línea).</w:t>
+        <w:br/>
+        <w:t xml:space="preserve">    - Cremón (Total 22 esquejes por línea): Lado A = 11 esquejes por línea | Lado B = 11 esquejes por línea (11 esquejes por cada lado; Cama completa = 22 esquejes por línea).</w:t>
+        <w:br/>
+        <w:t>• Campo Observaciones y Función "Pasó al otro lado": Cuando se registra una siembra bilateral o mixta, la app genera una cadena estructurada que se guarda en el campo observaciones de t_siembras_app:</w:t>
+        <w:br/>
+        <w:t xml:space="preserve">    - Formato Estándar: "CLON: 4-25 | LADO A (13 esq/lín)" o "LADO B (12 esq/lín)".</w:t>
+        <w:br/>
+        <w:t xml:space="preserve">    - Formato Mixto: "CLON: 4-25 | MIXTO: Lado A (14 lín) + Lado B (4 lín)". Esto documenta la labor de quien pasó al otro lado y permite a auditoría de nómina y costos desglosar con exactitud la labor de cada operario.</w:t>
+        <w:br/>
+        <w:t>• Áreas Especiales (Planta Madre, Bancos y Núcleos): En estas labores se almacena operario_id = 0 en la base de datos y se rotulan como "Sin Sembrador". Las consultas SQL de rendimiento en app/db/queries.py filtran explícitamente "WHERE operario_id &gt; 0", impidiendo que estas unidades vegetativas de propagación distorsionen los promedios y rankings de rendimiento laboral de los sembradores.</w:t>
+      </w:r>
+    </w:p>
+    <w:p>
+      <w:pPr>
         <w:pStyle w:val="Ttulo1"/>
         <w:spacing w:before="240" w:after="80"/>
         <w:rPr>
@@ -2712,6 +2585,102 @@
           </w:p>
         </w:tc>
       </w:tr>
+      <w:tr>
+        <w:tc>
+          <w:tcPr>
+            <w:tcW w:type="dxa" w:w="3216"/>
+          </w:tcPr>
+          <w:p>
+            <w:r>
+              <w:t>Operario reporta que no puede editar o eliminar una siembra (aparece icono de candado)</w:t>
+            </w:r>
+          </w:p>
+        </w:tc>
+        <w:tc>
+          <w:tcPr>
+            <w:tcW w:type="dxa" w:w="3216"/>
+          </w:tcPr>
+          <w:p>
+            <w:r>
+              <w:t>El registro tiene más de 2 días calendario desde la fecha de siembra. La regla de inmutabilidad bloquea la edición local en la app.</w:t>
+            </w:r>
+          </w:p>
+        </w:tc>
+        <w:tc>
+          <w:tcPr>
+            <w:tcW w:type="dxa" w:w="3216"/>
+          </w:tcPr>
+          <w:p>
+            <w:r>
+              <w:t>Verifique la justificación agronómica con el supervisor. Si la modificación procede, aplíquela directamente en Microsoft Access (bmempresarial2021.accdb).</w:t>
+            </w:r>
+          </w:p>
+        </w:tc>
+      </w:tr>
+      <w:tr>
+        <w:tc>
+          <w:tcPr>
+            <w:tcW w:type="dxa" w:w="3216"/>
+          </w:tcPr>
+          <w:p>
+            <w:r>
+              <w:t>Discrepancia en la cantidad de esquejes calculados en Pompón o Cremón</w:t>
+            </w:r>
+          </w:p>
+        </w:tc>
+        <w:tc>
+          <w:tcPr>
+            <w:tcW w:type="dxa" w:w="3216"/>
+          </w:tcPr>
+          <w:p>
+            <w:r>
+              <w:t>El operario seleccionó un lado de cama diferente al sembrado (Lado A vs Lado B) o ingresó líneas incorrectas en el modo mixto.</w:t>
+            </w:r>
+          </w:p>
+        </w:tc>
+        <w:tc>
+          <w:tcPr>
+            <w:tcW w:type="dxa" w:w="3216"/>
+          </w:tcPr>
+          <w:p>
+            <w:r>
+              <w:t>Consulte el campo observaciones en t_siembras_app para auditar el desglose de líneas sembradas por lado (Lado A x 13/11, Lado B x 12/11).</w:t>
+            </w:r>
+          </w:p>
+        </w:tc>
+      </w:tr>
+      <w:tr>
+        <w:tc>
+          <w:tcPr>
+            <w:tcW w:type="dxa" w:w="3216"/>
+          </w:tcPr>
+          <w:p>
+            <w:r>
+              <w:t>Las siembras de Planta Madre, Bancos o Núcleos no aparecen en el reporte de rendimiento laboral</w:t>
+            </w:r>
+          </w:p>
+        </w:tc>
+        <w:tc>
+          <w:tcPr>
+            <w:tcW w:type="dxa" w:w="3216"/>
+          </w:tcPr>
+          <w:p>
+            <w:r>
+              <w:t>Comportamiento correcto por diseño agronómico. Estas unidades de propagación se registran con operario_id = 0.</w:t>
+            </w:r>
+          </w:p>
+        </w:tc>
+        <w:tc>
+          <w:tcPr>
+            <w:tcW w:type="dxa" w:w="3216"/>
+          </w:tcPr>
+          <w:p>
+            <w:r>
+              <w:t>Explicar al supervisor que estas áreas corresponden a mantenimiento técnico vegetal y están deliberadamente excluidas de la medición de rendimiento de sembradores.</w:t>
+            </w:r>
+          </w:p>
+        </w:tc>
+      </w:tr>
     </w:tbl>
     <w:p>
       <w:pPr>

</xml_diff>

<commit_message>
feat(lirios): conteo por parrilla (143 LA, 63 LO/OT), siembra colectiva sin operario en cama, y rendimientos por canastas (LA: 400/425/450, LO/OT: 200/225/250) con RendimientoLiriosScreen
</commit_message>
<xml_diff>
--- a/DOCUMENTACION_SOPORTE.docx
+++ b/DOCUMENTACION_SOPORTE.docx
@@ -3187,6 +3187,60 @@
         </w:rPr>
       </w:pPr>
     </w:p>
+    <w:p>
+      <w:pPr>
+        <w:pStyle w:val="Ttulo1"/>
+      </w:pPr>
+      <w:r>
+        <w:t>ESPECIFICACIÓN TÉCNICA: TABLA TB_LIRIOS_CANASTAS Y PARRILLAS</w:t>
+      </w:r>
+    </w:p>
+    <w:p>
+      <w:r>
+        <w:t>Para soportar el modelo de rendimiento por canastas y el conteo por parrillas en Lirios, se introdujeron los siguientes elementos en la base de datos local SQLite y la lógica de negocio:</w:t>
+      </w:r>
+    </w:p>
+    <w:p>
+      <w:r>
+        <w:rPr>
+          <w:b/>
+        </w:rPr>
+        <w:t xml:space="preserve">• Tabla tb_lirios_canastas: </w:t>
+      </w:r>
+      <w:r>
+        <w:t>Campos: id, uuid, fecha, subgrupo ('LA', 'LO', 'OT'), operario_id, operario_nombre, cantidad_bulbos, hora, sincronizado, observaciones.</w:t>
+        <w:br/>
+      </w:r>
+      <w:r>
+        <w:rPr>
+          <w:b/>
+        </w:rPr>
+        <w:t xml:space="preserve">• Índices Creados: </w:t>
+      </w:r>
+      <w:r>
+        <w:t>idx_lirios_canastas_fecha, idx_lirios_canastas_subgrupo, idx_lirios_canastas_operario.</w:t>
+        <w:br/>
+      </w:r>
+      <w:r>
+        <w:rPr>
+          <w:b/>
+        </w:rPr>
+        <w:t xml:space="preserve">• Configuración Agronómica: </w:t>
+      </w:r>
+      <w:r>
+        <w:t>Densidad por defecto fijada en 143 para LA y 63 para LO y OT en tb_config_agronomica y tb_variedades.</w:t>
+        <w:br/>
+      </w:r>
+      <w:r>
+        <w:rPr>
+          <w:b/>
+        </w:rPr>
+        <w:t xml:space="preserve">• Desacoplamiento de Cama: </w:t>
+      </w:r>
+      <w:r>
+        <w:t>Las siembras de Lirios registran operario_id = 0 para permitir camas compartidas y auditoría global sin sesgar el rendimiento individual, el cual se audita exclusivamente desde tb_lirios_canastas.</w:t>
+      </w:r>
+    </w:p>
     <w:sectPr>
       <w:headerReference w:type="default" r:id="rId8"/>
       <w:footerReference w:type="default" r:id="rId9"/>

</xml_diff>

<commit_message>
docs: actualizar manual de usuario, soporte tecnico, informe ieee y explicacion tecnica con modulo de lirios, canastas y tarjetas de compra
</commit_message>
<xml_diff>
--- a/DOCUMENTACION_SOPORTE.docx
+++ b/DOCUMENTACION_SOPORTE.docx
@@ -3190,55 +3190,88 @@
     <w:p>
       <w:pPr>
         <w:pStyle w:val="Ttulo1"/>
+        <w:spacing w:before="280" w:after="120"/>
       </w:pPr>
       <w:r>
-        <w:t>ESPECIFICACIÓN TÉCNICA: TABLA TB_LIRIOS_CANASTAS Y PARRILLAS</w:t>
+        <w:t>ESPECIFICACIÓN TÉCNICA: MÓDULO DE LIRIOS, MODELO DE CANASTAS Y ARQUITECTURA DE UI RESPONSIVA</w:t>
       </w:r>
     </w:p>
     <w:p>
       <w:r>
-        <w:t>Para soportar el modelo de rendimiento por canastas y el conteo por parrillas en Lirios, se introdujeron los siguientes elementos en la base de datos local SQLite y la lógica de negocio:</w:t>
+        <w:t>El módulo de Lirios incorpora una arquitectura especializada tanto a nivel de persistencia de datos (SQLite local y sincronización con Microsoft Access) como a nivel de capa de presentación en Flutter (prevención de desbordes gráficos y scroll elástico continuo).</w:t>
+      </w:r>
+    </w:p>
+    <w:p>
+      <w:pPr>
+        <w:pStyle w:val="Ttulo2"/>
+      </w:pPr>
+      <w:r>
+        <w:t>1. Estructura de Datos y Modelo Relacional SQLite</w:t>
       </w:r>
     </w:p>
     <w:p>
       <w:r>
-        <w:rPr>
-          <w:b/>
-        </w:rPr>
-        <w:t xml:space="preserve">• Tabla tb_lirios_canastas: </w:t>
+        <w:t>• Tabla tb_lirios_canastas:</w:t>
+        <w:br/>
+        <w:t xml:space="preserve">  - Definición DDL: CREATE TABLE IF NOT EXISTS tb_lirios_canastas (id INTEGER PRIMARY KEY AUTOINCREMENT, uuid TEXT UNIQUE, fecha TEXT NOT NULL, subgrupo TEXT NOT NULL, operario_id INTEGER NOT NULL, operario_nombre TEXT, cantidad_bulbos INTEGER NOT NULL, hora TEXT, sincronizado INTEGER DEFAULT 0, observaciones TEXT);</w:t>
+        <w:br/>
+        <w:t xml:space="preserve">  - Índices de Rendimiento: idx_lirios_canastas_fecha, idx_lirios_canastas_subgrupo, idx_lirios_canastas_operario.</w:t>
+        <w:br/>
+        <w:t xml:space="preserve">  - Propósito: Auditar las entregas de canastas en tiempo real sin interferir con la tabla principal de siembras en camas.</w:t>
+        <w:br/>
+        <w:t>• Catálogo de Importación tb_lirios_187:</w:t>
+        <w:br/>
+        <w:t xml:space="preserve">  - Definición DDL: CREATE TABLE IF NOT EXISTS tb_lirios_187 (id INTEGER PRIMARY KEY AUTOINCREMENT, proveedor TEXT, contenedor TEXT, lote TEXT, variedad TEXT, variedad_id INTEGER);</w:t>
+        <w:br/>
+        <w:t xml:space="preserve">  - Estrategia de Sincronización: Método dbRepo.reemplazarLirios187() ejecuta un borrado y lote masivo atómico dentro de una transacción SQLite única (batch.insert).</w:t>
       </w:r>
+    </w:p>
+    <w:p>
+      <w:pPr>
+        <w:pStyle w:val="Ttulo2"/>
+      </w:pPr>
       <w:r>
-        <w:t>Campos: id, uuid, fecha, subgrupo ('LA', 'LO', 'OT'), operario_id, operario_nombre, cantidad_bulbos, hora, sincronizado, observaciones.</w:t>
+        <w:t>2. Reglas Agronómicas y Desacoplamiento de Cama</w:t>
+      </w:r>
+    </w:p>
+    <w:p>
+      <w:r>
+        <w:t>• Densidades Fijas por Parrilla: 143 bulbos por parrilla para Lirio LA; 63 bulbos por parrilla para Lirios LO y OT.</w:t>
         <w:br/>
+        <w:t>• Desacoplamiento de Operario: Las siembras de Lirios en cama registran operario_id = 0 de forma análoga a Plantas Madre y Núcleos de Propagación, habilitando el registro de camas trabajadas en cuadrilla sin distorsionar el motor de rendimiento individual, el cual se calcula de forma autónoma a partir de tb_lirios_canastas.</w:t>
+        <w:br/>
+        <w:t>• Canastas Estándar Parametrizadas: Mapa _canastasOpciones define [400, 425, 450] para LA y [200, 225, 250] para LO/OT, permitiendo adicionalmente registros personalizados con validación numérica estricta.</w:t>
       </w:r>
+    </w:p>
+    <w:p>
+      <w:pPr>
+        <w:pStyle w:val="Ttulo2"/>
+      </w:pPr>
       <w:r>
-        <w:rPr>
-          <w:b/>
-        </w:rPr>
-        <w:t xml:space="preserve">• Índices Creados: </w:t>
+        <w:t>3. Arquitectura de Interfaz Responsiva y Mitigación de Desbordes (RenderFlex Overflow)</w:t>
       </w:r>
+    </w:p>
+    <w:p>
       <w:r>
-        <w:t>idx_lirios_canastas_fecha, idx_lirios_canastas_subgrupo, idx_lirios_canastas_operario.</w:t>
+        <w:t>• Mitigación de Desbordes Horizontales (_buildStatRow):</w:t>
         <w:br/>
-      </w:r>
-      <w:r>
-        <w:rPr>
-          <w:b/>
-        </w:rPr>
-        <w:t xml:space="preserve">• Configuración Agronómica: </w:t>
-      </w:r>
-      <w:r>
-        <w:t>Densidad por defecto fijada en 143 para LA y 63 para LO y OT en tb_config_agronomica y tb_variedades.</w:t>
+        <w:t xml:space="preserve">  - Causa Raíz del Defecto: El uso previo de filas Row no acotadas con widgets Text adyacentes causaba excepciones RenderFlex overflowed (visibles en pantalla como barras rayadas amarillas y negras) ante nombres de proveedores extensos (ej. compañías holandesas de exportación) o números de lote largos.</w:t>
         <w:br/>
-      </w:r>
-      <w:r>
-        <w:rPr>
-          <w:b/>
-        </w:rPr>
-        <w:t xml:space="preserve">• Desacoplamiento de Cama: </w:t>
-      </w:r>
-      <w:r>
-        <w:t>Las siembras de Lirios registran operario_id = 0 para permitir camas compartidas y auditoría global sin sesgar el rendimiento individual, el cual se audita exclusivamente desde tb_lirios_canastas.</w:t>
+        <w:t xml:space="preserve">  - Solución Implementada: Normalización de _buildStatRow empleando Expanded(flex: 4) para la etiqueta y Expanded(flex: 6) para el valor, con soporte de alineación a la derecha y salto multilínea automático sin pérdida de visibilidad.</w:t>
+        <w:br/>
+        <w:t>• Componentes de Tarjetas de Compra con Chips Adaptativos:</w:t>
+        <w:br/>
+        <w:t xml:space="preserve">  - Implementación de _buildChipDetalle y _buildMiniChip basados en Wrap con márgenes simétricos y contenedores BoxDecoration con bordes verdes suaves (#81C784, #A5D6A7), permitiendo que los atributos de importación (Lote, Proveedor, Contenedor, Variedad) fluyan armónicamente en cualquier resolución o proporción de aspecto.</w:t>
+        <w:br/>
+        <w:t>• Resiliencia de Viewport y Manejo de Teclado Virtual en Modales:</w:t>
+        <w:br/>
+        <w:t xml:space="preserve">  - En showModalBottomSheet (_abrirModalEntregaCanasta y _mostrarDetalleSiembra), el contenido está encapsulado dentro de ConstrainedBox(maxHeight: 0.90 * height) y SingleChildScrollView(physics: BouncingScrollPhysics()), compensando dinámicamente MediaQuery.of(ctx).viewInsets.bottom.</w:t>
+        <w:br/>
+        <w:t xml:space="preserve">  - Esto previene el bloqueo de desplazamiento ("no me deja bajar") y asegura que los botones táctiles y campos de texto permanezcan siempre accesibles cuando se despliega el teclado numérico en Android.</w:t>
+        <w:br/>
+        <w:t>• Scrollability Universal en Listas de Operarios:</w:t>
+        <w:br/>
+        <w:t xml:space="preserve">  - Aplicación de AlwaysScrollableScrollPhysics con margen inferior de 70 px en RendimientoLiriosScreen y RendimientoDialog, garantizando que el usuario pueda bajar continuamente hasta el último registro sin que la barra de navegación del sistema operativo lo oculte.</w:t>
       </w:r>
     </w:p>
     <w:sectPr>

</xml_diff>